<commit_message>
3 more names are addede to list
</commit_message>
<xml_diff>
--- a/dummy-file.docx
+++ b/dummy-file.docx
@@ -14,9 +14,38 @@
     </w:p>
     <w:p>
       <w:r>
-        <w:t>3)pratiksha</w:t>
+        <w:t>3)</w:t>
+      </w:r>
+      <w:r>
+        <w:t>Pratiksha</w:t>
       </w:r>
     </w:p>
+    <w:p>
+      <w:r>
+        <w:t>4)Ankita</w:t>
+      </w:r>
+    </w:p>
+    <w:p>
+      <w:r>
+        <w:t>5)</w:t>
+      </w:r>
+      <w:proofErr w:type="spellStart"/>
+      <w:r>
+        <w:t>amruta</w:t>
+      </w:r>
+      <w:proofErr w:type="spellEnd"/>
+    </w:p>
+    <w:p>
+      <w:r>
+        <w:t>6)</w:t>
+      </w:r>
+      <w:proofErr w:type="spellStart"/>
+      <w:r>
+        <w:t>nishu</w:t>
+      </w:r>
+      <w:proofErr w:type="spellEnd"/>
+    </w:p>
+    <w:p/>
     <w:sectPr>
       <w:pgSz w:w="16838" w:h="11906" w:orient="landscape" w:code="9"/>
       <w:pgMar w:top="720" w:right="7057" w:bottom="720" w:left="720" w:header="709" w:footer="709" w:gutter="0"/>

</xml_diff>